<commit_message>
Russian Translation of Manuscript and Supplement; Rendered PDF and DOCX
Co-Authored-By: Claude Opus 5.5 (1M context) <noreply@anthropic.com>
</commit_message>
<xml_diff>
--- a/paper/manuscript.docx
+++ b/paper/manuscript.docx
@@ -5400,7 +5400,51 @@
         <w:t xml:space="preserve"> </w:t>
       </w:r>
       <w:r>
-        <w:t xml:space="preserve">7-point median distorts exposure substantially, even when the ratio of odds ratios stays near</w:t>
+        <w:t xml:space="preserve">7-point median distorts exposure substantially, even when the ratio of odds ratios stays</w:t>
+      </w:r>
+      <w:r>
+        <w:t xml:space="preserve"> </w:t>
+      </w:r>
+      <w:r>
+        <w:t xml:space="preserve">near 1. The AWAKE trial showed that the monitoring method changes measured and treated hypotension</w:t>
+      </w:r>
+      <w:r>
+        <w:t xml:space="preserve"> </w:t>
+      </w:r>
+      <w:r>
+        <w:t xml:space="preserve">at induction [28]. Our resolution results are the retrospective counterpart.</w:t>
+      </w:r>
+    </w:p>
+    <w:p>
+      <w:pPr>
+        <w:pStyle w:val="BodyText"/>
+      </w:pPr>
+      <w:r>
+        <w:t xml:space="preserve">Wax et al [29]. and a recent preprint from the MOVER cohort [30] treated disagreement between</w:t>
+      </w:r>
+      <w:r>
+        <w:t xml:space="preserve"> </w:t>
+      </w:r>
+      <w:r>
+        <w:t xml:space="preserve">cuff and arterial pressure as clinical information. Arterial artefact rose sixfold during the</w:t>
+      </w:r>
+      <w:r>
+        <w:t xml:space="preserve"> </w:t>
+      </w:r>
+      <w:r>
+        <w:t xml:space="preserve">cuff cycle, mostly as a non-pulsatile trace. This is a measurement mechanism that generates</w:t>
+      </w:r>
+      <w:r>
+        <w:t xml:space="preserve"> </w:t>
+      </w:r>
+      <w:r>
+        <w:t xml:space="preserve">such disagreement. The pattern fits occlusion of the cannulated arm in part, because the</w:t>
+      </w:r>
+      <w:r>
+        <w:t xml:space="preserve"> </w:t>
+      </w:r>
+      <w:r>
+        <w:t xml:space="preserve">excess was:</w:t>
       </w:r>
     </w:p>
     <w:p>
@@ -5412,45 +5456,7 @@
         </w:numPr>
       </w:pPr>
       <w:r>
-        <w:t xml:space="preserve">The AWAKE trial showed that the monitoring method changes measured and treated hypotension</w:t>
-      </w:r>
-      <w:r>
-        <w:t xml:space="preserve"> </w:t>
-      </w:r>
-      <w:r>
-        <w:t xml:space="preserve">at induction [28]. Our resolution results are the retrospective counterpart.</w:t>
-      </w:r>
-    </w:p>
-    <w:p>
-      <w:pPr>
-        <w:pStyle w:val="FirstParagraph"/>
-      </w:pPr>
-      <w:r>
-        <w:t xml:space="preserve">Wax et al [29]. and a recent preprint from the MOVER cohort [30] treated disagreement between</w:t>
-      </w:r>
-      <w:r>
-        <w:t xml:space="preserve"> </w:t>
-      </w:r>
-      <w:r>
-        <w:t xml:space="preserve">cuff and arterial pressure as clinical information. Arterial artefact rose sixfold during the</w:t>
-      </w:r>
-      <w:r>
-        <w:t xml:space="preserve"> </w:t>
-      </w:r>
-      <w:r>
-        <w:t xml:space="preserve">cuff cycle, mostly as a non-pulsatile trace. This is a measurement mechanism that generates</w:t>
-      </w:r>
-      <w:r>
-        <w:t xml:space="preserve"> </w:t>
-      </w:r>
-      <w:r>
-        <w:t xml:space="preserve">such disagreement. The pattern fits occlusion of the cannulated arm in part, because the</w:t>
-      </w:r>
-      <w:r>
-        <w:t xml:space="preserve"> </w:t>
-      </w:r>
-      <w:r>
-        <w:t xml:space="preserve">excess was:</w:t>
+        <w:t xml:space="preserve">larger with radial than with lower-limb catheters;</w:t>
       </w:r>
     </w:p>
     <w:p>
@@ -5458,11 +5464,11 @@
         <w:pStyle w:val="Compact"/>
         <w:numPr>
           <w:ilvl w:val="0"/>
-          <w:numId w:val="1045"/>
-        </w:numPr>
-      </w:pPr>
-      <w:r>
-        <w:t xml:space="preserve">larger with radial than with lower-limb catheters;</w:t>
+          <w:numId w:val="1044"/>
+        </w:numPr>
+      </w:pPr>
+      <w:r>
+        <w:t xml:space="preserve">larger on the right than on the left;</w:t>
       </w:r>
     </w:p>
     <w:p>
@@ -5470,11 +5476,11 @@
         <w:pStyle w:val="Compact"/>
         <w:numPr>
           <w:ilvl w:val="0"/>
-          <w:numId w:val="1045"/>
-        </w:numPr>
-      </w:pPr>
-      <w:r>
-        <w:t xml:space="preserve">larger on the right than on the left;</w:t>
+          <w:numId w:val="1044"/>
+        </w:numPr>
+      </w:pPr>
+      <w:r>
+        <w:t xml:space="preserve">present at regularly cycled readings;</w:t>
       </w:r>
     </w:p>
     <w:p>
@@ -5482,19 +5488,7 @@
         <w:pStyle w:val="Compact"/>
         <w:numPr>
           <w:ilvl w:val="0"/>
-          <w:numId w:val="1045"/>
-        </w:numPr>
-      </w:pPr>
-      <w:r>
-        <w:t xml:space="preserve">present at regularly cycled readings;</w:t>
-      </w:r>
-    </w:p>
-    <w:p>
-      <w:pPr>
-        <w:pStyle w:val="Compact"/>
-        <w:numPr>
-          <w:ilvl w:val="0"/>
-          <w:numId w:val="1045"/>
+          <w:numId w:val="1044"/>
         </w:numPr>
       </w:pPr>
       <w:r>
@@ -5574,7 +5568,7 @@
         <w:pStyle w:val="FirstParagraph"/>
         <w:numPr>
           <w:ilvl w:val="0"/>
-          <w:numId w:val="1046"/>
+          <w:numId w:val="1045"/>
         </w:numPr>
       </w:pPr>
       <w:r>
@@ -5592,7 +5586,7 @@
         <w:pStyle w:val="FirstParagraph"/>
         <w:numPr>
           <w:ilvl w:val="0"/>
-          <w:numId w:val="1046"/>
+          <w:numId w:val="1045"/>
         </w:numPr>
       </w:pPr>
       <w:r>
@@ -5604,7 +5598,7 @@
         <w:pStyle w:val="FirstParagraph"/>
         <w:numPr>
           <w:ilvl w:val="0"/>
-          <w:numId w:val="1046"/>
+          <w:numId w:val="1045"/>
         </w:numPr>
       </w:pPr>
       <w:r>
@@ -5616,7 +5610,7 @@
         <w:pStyle w:val="FirstParagraph"/>
         <w:numPr>
           <w:ilvl w:val="0"/>
-          <w:numId w:val="1046"/>
+          <w:numId w:val="1045"/>
         </w:numPr>
       </w:pPr>
       <w:r>
@@ -5652,7 +5646,7 @@
         <w:pStyle w:val="FirstParagraph"/>
         <w:numPr>
           <w:ilvl w:val="0"/>
-          <w:numId w:val="1047"/>
+          <w:numId w:val="1046"/>
         </w:numPr>
       </w:pPr>
       <w:r>
@@ -5676,7 +5670,7 @@
         <w:pStyle w:val="FirstParagraph"/>
         <w:numPr>
           <w:ilvl w:val="0"/>
-          <w:numId w:val="1047"/>
+          <w:numId w:val="1046"/>
         </w:numPr>
       </w:pPr>
       <w:r>
@@ -5694,7 +5688,7 @@
         <w:pStyle w:val="FirstParagraph"/>
         <w:numPr>
           <w:ilvl w:val="0"/>
-          <w:numId w:val="1047"/>
+          <w:numId w:val="1046"/>
         </w:numPr>
       </w:pPr>
       <w:r>
@@ -5712,7 +5706,7 @@
         <w:pStyle w:val="FirstParagraph"/>
         <w:numPr>
           <w:ilvl w:val="0"/>
-          <w:numId w:val="1047"/>
+          <w:numId w:val="1046"/>
         </w:numPr>
       </w:pPr>
       <w:r>
@@ -5762,69 +5756,69 @@
         <w:pStyle w:val="FirstParagraph"/>
         <w:numPr>
           <w:ilvl w:val="0"/>
+          <w:numId w:val="1046"/>
+        </w:numPr>
+      </w:pPr>
+      <w:r>
+        <w:t xml:space="preserve">Where possible, the cuff should be placed on the limb opposite an arterial line [9].</w:t>
+      </w:r>
+      <w:r>
+        <w:t xml:space="preserve"> </w:t>
+      </w:r>
+      <w:r>
+        <w:t xml:space="preserve">The cuff remains an essential cross-check of the arterial line.</w:t>
+      </w:r>
+    </w:p>
+    <w:p>
+      <w:pPr>
+        <w:pStyle w:val="Heading2"/>
+      </w:pPr>
+      <w:bookmarkStart w:id="30" w:name="_c1ba7aafc947b0c6beccb058597d2038a69972e"/>
+      <w:r>
+        <w:t xml:space="preserve">Strengths and limitations</w:t>
+      </w:r>
+      <w:bookmarkEnd w:id="30"/>
+    </w:p>
+    <w:p>
+      <w:pPr>
+        <w:pStyle w:val="FirstParagraph"/>
+      </w:pPr>
+      <w:r>
+        <w:t xml:space="preserve">The reference comes from the waveform recorded alongside the numbers and never replaces</w:t>
+      </w:r>
+      <w:r>
+        <w:t xml:space="preserve"> </w:t>
+      </w:r>
+      <w:r>
+        <w:t xml:space="preserve">monitor values. The protocol was frozen after a permuted dry run, and every later change is</w:t>
+      </w:r>
+      <w:r>
+        <w:t xml:space="preserve"> </w:t>
+      </w:r>
+      <w:r>
+        <w:t xml:space="preserve">documented. The reference was checked against independent signals, and all data and code are</w:t>
+      </w:r>
+      <w:r>
+        <w:t xml:space="preserve"> </w:t>
+      </w:r>
+      <w:r>
+        <w:t xml:space="preserve">public.</w:t>
+      </w:r>
+    </w:p>
+    <w:p>
+      <w:pPr>
+        <w:pStyle w:val="BodyText"/>
+      </w:pPr>
+      <w:r>
+        <w:t xml:space="preserve">Limitations:</w:t>
+      </w:r>
+    </w:p>
+    <w:p>
+      <w:pPr>
+        <w:pStyle w:val="FirstParagraph"/>
+        <w:numPr>
+          <w:ilvl w:val="0"/>
           <w:numId w:val="1047"/>
-        </w:numPr>
-      </w:pPr>
-      <w:r>
-        <w:t xml:space="preserve">Where possible, the cuff should be placed on the limb opposite an arterial line [9].</w:t>
-      </w:r>
-      <w:r>
-        <w:t xml:space="preserve"> </w:t>
-      </w:r>
-      <w:r>
-        <w:t xml:space="preserve">The cuff remains an essential cross-check of the arterial line.</w:t>
-      </w:r>
-    </w:p>
-    <w:p>
-      <w:pPr>
-        <w:pStyle w:val="Heading2"/>
-      </w:pPr>
-      <w:bookmarkStart w:id="30" w:name="_c1ba7aafc947b0c6beccb058597d2038a69972e"/>
-      <w:r>
-        <w:t xml:space="preserve">Strengths and limitations</w:t>
-      </w:r>
-      <w:bookmarkEnd w:id="30"/>
-    </w:p>
-    <w:p>
-      <w:pPr>
-        <w:pStyle w:val="FirstParagraph"/>
-      </w:pPr>
-      <w:r>
-        <w:t xml:space="preserve">The reference comes from the waveform recorded alongside the numbers and never replaces</w:t>
-      </w:r>
-      <w:r>
-        <w:t xml:space="preserve"> </w:t>
-      </w:r>
-      <w:r>
-        <w:t xml:space="preserve">monitor values. The protocol was frozen after a permuted dry run, and every later change is</w:t>
-      </w:r>
-      <w:r>
-        <w:t xml:space="preserve"> </w:t>
-      </w:r>
-      <w:r>
-        <w:t xml:space="preserve">documented. The reference was checked against independent signals, and all data and code are</w:t>
-      </w:r>
-      <w:r>
-        <w:t xml:space="preserve"> </w:t>
-      </w:r>
-      <w:r>
-        <w:t xml:space="preserve">public.</w:t>
-      </w:r>
-    </w:p>
-    <w:p>
-      <w:pPr>
-        <w:pStyle w:val="BodyText"/>
-      </w:pPr>
-      <w:r>
-        <w:t xml:space="preserve">Limitations:</w:t>
-      </w:r>
-    </w:p>
-    <w:p>
-      <w:pPr>
-        <w:pStyle w:val="FirstParagraph"/>
-        <w:numPr>
-          <w:ilvl w:val="0"/>
-          <w:numId w:val="1048"/>
         </w:numPr>
       </w:pPr>
       <w:r>
@@ -5858,7 +5852,7 @@
         <w:pStyle w:val="FirstParagraph"/>
         <w:numPr>
           <w:ilvl w:val="0"/>
-          <w:numId w:val="1048"/>
+          <w:numId w:val="1047"/>
         </w:numPr>
       </w:pPr>
       <w:r>
@@ -5892,7 +5886,7 @@
         <w:pStyle w:val="FirstParagraph"/>
         <w:numPr>
           <w:ilvl w:val="0"/>
-          <w:numId w:val="1048"/>
+          <w:numId w:val="1047"/>
         </w:numPr>
       </w:pPr>
       <w:r>
@@ -5937,7 +5931,7 @@
         <w:pStyle w:val="FirstParagraph"/>
         <w:numPr>
           <w:ilvl w:val="1"/>
-          <w:numId w:val="1049"/>
+          <w:numId w:val="1048"/>
         </w:numPr>
       </w:pPr>
       <w:r>
@@ -5955,7 +5949,7 @@
         <w:pStyle w:val="FirstParagraph"/>
         <w:numPr>
           <w:ilvl w:val="1"/>
-          <w:numId w:val="1049"/>
+          <w:numId w:val="1048"/>
         </w:numPr>
       </w:pPr>
       <w:r>
@@ -5967,7 +5961,7 @@
         <w:pStyle w:val="FirstParagraph"/>
         <w:numPr>
           <w:ilvl w:val="1"/>
-          <w:numId w:val="1049"/>
+          <w:numId w:val="1048"/>
         </w:numPr>
       </w:pPr>
       <w:r>
@@ -5979,7 +5973,7 @@
         <w:pStyle w:val="FirstParagraph"/>
         <w:numPr>
           <w:ilvl w:val="1"/>
-          <w:numId w:val="1049"/>
+          <w:numId w:val="1048"/>
         </w:numPr>
       </w:pPr>
       <w:r>
@@ -6021,7 +6015,7 @@
         <w:pStyle w:val="FirstParagraph"/>
         <w:numPr>
           <w:ilvl w:val="0"/>
-          <w:numId w:val="1048"/>
+          <w:numId w:val="1047"/>
         </w:numPr>
       </w:pPr>
       <w:r>
@@ -6049,7 +6043,7 @@
         <w:pStyle w:val="FirstParagraph"/>
         <w:numPr>
           <w:ilvl w:val="0"/>
-          <w:numId w:val="1048"/>
+          <w:numId w:val="1047"/>
         </w:numPr>
       </w:pPr>
       <w:r>
@@ -6077,7 +6071,7 @@
         <w:pStyle w:val="FirstParagraph"/>
         <w:numPr>
           <w:ilvl w:val="0"/>
-          <w:numId w:val="1048"/>
+          <w:numId w:val="1047"/>
         </w:numPr>
       </w:pPr>
       <w:r>
@@ -6111,7 +6105,7 @@
         <w:pStyle w:val="FirstParagraph"/>
         <w:numPr>
           <w:ilvl w:val="0"/>
-          <w:numId w:val="1048"/>
+          <w:numId w:val="1047"/>
         </w:numPr>
       </w:pPr>
       <w:r>
@@ -6139,7 +6133,7 @@
         <w:pStyle w:val="FirstParagraph"/>
         <w:numPr>
           <w:ilvl w:val="0"/>
-          <w:numId w:val="1048"/>
+          <w:numId w:val="1047"/>
         </w:numPr>
       </w:pPr>
       <w:r>
@@ -6167,7 +6161,7 @@
         <w:pStyle w:val="FirstParagraph"/>
         <w:numPr>
           <w:ilvl w:val="0"/>
-          <w:numId w:val="1048"/>
+          <w:numId w:val="1047"/>
         </w:numPr>
       </w:pPr>
       <w:r>
@@ -6405,7 +6399,7 @@
         <w:pStyle w:val="FirstParagraph"/>
         <w:numPr>
           <w:ilvl w:val="0"/>
-          <w:numId w:val="1050"/>
+          <w:numId w:val="1049"/>
         </w:numPr>
       </w:pPr>
       <w:r>
@@ -6417,7 +6411,7 @@
         <w:pStyle w:val="FirstParagraph"/>
         <w:numPr>
           <w:ilvl w:val="0"/>
-          <w:numId w:val="1050"/>
+          <w:numId w:val="1049"/>
         </w:numPr>
       </w:pPr>
       <w:r>
@@ -6429,7 +6423,7 @@
         <w:pStyle w:val="FirstParagraph"/>
         <w:numPr>
           <w:ilvl w:val="0"/>
-          <w:numId w:val="1050"/>
+          <w:numId w:val="1049"/>
         </w:numPr>
       </w:pPr>
       <w:r>
@@ -6447,7 +6441,7 @@
         <w:pStyle w:val="FirstParagraph"/>
         <w:numPr>
           <w:ilvl w:val="0"/>
-          <w:numId w:val="1050"/>
+          <w:numId w:val="1049"/>
         </w:numPr>
       </w:pPr>
       <w:r>
@@ -6573,7 +6567,7 @@
         <w:pStyle w:val="Compact"/>
         <w:numPr>
           <w:ilvl w:val="0"/>
-          <w:numId w:val="1051"/>
+          <w:numId w:val="1050"/>
         </w:numPr>
       </w:pPr>
       <w:r>
@@ -6585,7 +6579,7 @@
         <w:pStyle w:val="Compact"/>
         <w:numPr>
           <w:ilvl w:val="0"/>
-          <w:numId w:val="1051"/>
+          <w:numId w:val="1050"/>
         </w:numPr>
       </w:pPr>
       <w:r>
@@ -6597,7 +6591,7 @@
         <w:pStyle w:val="Compact"/>
         <w:numPr>
           <w:ilvl w:val="0"/>
-          <w:numId w:val="1051"/>
+          <w:numId w:val="1050"/>
         </w:numPr>
       </w:pPr>
       <w:r>
@@ -6609,7 +6603,7 @@
         <w:pStyle w:val="Compact"/>
         <w:numPr>
           <w:ilvl w:val="0"/>
-          <w:numId w:val="1051"/>
+          <w:numId w:val="1050"/>
         </w:numPr>
       </w:pPr>
       <w:r>
@@ -6711,7 +6705,7 @@
         <w:pStyle w:val="Compact"/>
         <w:numPr>
           <w:ilvl w:val="0"/>
-          <w:numId w:val="1052"/>
+          <w:numId w:val="1051"/>
         </w:numPr>
       </w:pPr>
       <w:r>
@@ -6723,7 +6717,7 @@
         <w:pStyle w:val="Compact"/>
         <w:numPr>
           <w:ilvl w:val="0"/>
-          <w:numId w:val="1052"/>
+          <w:numId w:val="1051"/>
         </w:numPr>
       </w:pPr>
       <w:r>
@@ -6735,7 +6729,7 @@
         <w:pStyle w:val="Compact"/>
         <w:numPr>
           <w:ilvl w:val="0"/>
-          <w:numId w:val="1052"/>
+          <w:numId w:val="1051"/>
         </w:numPr>
       </w:pPr>
       <w:r>
@@ -6747,7 +6741,7 @@
         <w:pStyle w:val="Compact"/>
         <w:numPr>
           <w:ilvl w:val="0"/>
-          <w:numId w:val="1052"/>
+          <w:numId w:val="1051"/>
         </w:numPr>
       </w:pPr>
       <w:r>
@@ -6859,7 +6853,7 @@
         <w:pStyle w:val="Compact"/>
         <w:numPr>
           <w:ilvl w:val="0"/>
-          <w:numId w:val="1053"/>
+          <w:numId w:val="1052"/>
         </w:numPr>
       </w:pPr>
       <w:r>
@@ -6871,7 +6865,7 @@
         <w:pStyle w:val="Compact"/>
         <w:numPr>
           <w:ilvl w:val="0"/>
-          <w:numId w:val="1053"/>
+          <w:numId w:val="1052"/>
         </w:numPr>
       </w:pPr>
       <w:r>
@@ -6883,7 +6877,7 @@
         <w:pStyle w:val="Compact"/>
         <w:numPr>
           <w:ilvl w:val="0"/>
-          <w:numId w:val="1053"/>
+          <w:numId w:val="1052"/>
         </w:numPr>
       </w:pPr>
       <w:r>
@@ -6895,7 +6889,7 @@
         <w:pStyle w:val="Compact"/>
         <w:numPr>
           <w:ilvl w:val="0"/>
-          <w:numId w:val="1053"/>
+          <w:numId w:val="1052"/>
         </w:numPr>
       </w:pPr>
       <w:r>
@@ -6907,7 +6901,7 @@
         <w:pStyle w:val="Compact"/>
         <w:numPr>
           <w:ilvl w:val="0"/>
-          <w:numId w:val="1053"/>
+          <w:numId w:val="1052"/>
         </w:numPr>
       </w:pPr>
       <w:r>
@@ -6919,7 +6913,7 @@
         <w:pStyle w:val="Compact"/>
         <w:numPr>
           <w:ilvl w:val="0"/>
-          <w:numId w:val="1053"/>
+          <w:numId w:val="1052"/>
         </w:numPr>
       </w:pPr>
       <w:r>
@@ -6931,7 +6925,7 @@
         <w:pStyle w:val="Compact"/>
         <w:numPr>
           <w:ilvl w:val="0"/>
-          <w:numId w:val="1053"/>
+          <w:numId w:val="1052"/>
         </w:numPr>
       </w:pPr>
       <w:r>
@@ -6943,7 +6937,7 @@
         <w:pStyle w:val="Compact"/>
         <w:numPr>
           <w:ilvl w:val="0"/>
-          <w:numId w:val="1053"/>
+          <w:numId w:val="1052"/>
         </w:numPr>
       </w:pPr>
       <w:r>
@@ -6955,7 +6949,7 @@
         <w:pStyle w:val="Compact"/>
         <w:numPr>
           <w:ilvl w:val="0"/>
-          <w:numId w:val="1053"/>
+          <w:numId w:val="1052"/>
         </w:numPr>
       </w:pPr>
       <w:r>
@@ -6967,7 +6961,7 @@
         <w:pStyle w:val="Compact"/>
         <w:numPr>
           <w:ilvl w:val="0"/>
-          <w:numId w:val="1053"/>
+          <w:numId w:val="1052"/>
         </w:numPr>
       </w:pPr>
       <w:r>
@@ -6979,7 +6973,7 @@
         <w:pStyle w:val="Compact"/>
         <w:numPr>
           <w:ilvl w:val="0"/>
-          <w:numId w:val="1053"/>
+          <w:numId w:val="1052"/>
         </w:numPr>
       </w:pPr>
       <w:r>
@@ -6991,7 +6985,7 @@
         <w:pStyle w:val="Compact"/>
         <w:numPr>
           <w:ilvl w:val="0"/>
-          <w:numId w:val="1053"/>
+          <w:numId w:val="1052"/>
         </w:numPr>
       </w:pPr>
       <w:r>
@@ -7003,7 +6997,7 @@
         <w:pStyle w:val="Compact"/>
         <w:numPr>
           <w:ilvl w:val="0"/>
-          <w:numId w:val="1053"/>
+          <w:numId w:val="1052"/>
         </w:numPr>
       </w:pPr>
       <w:r>
@@ -7015,7 +7009,7 @@
         <w:pStyle w:val="Compact"/>
         <w:numPr>
           <w:ilvl w:val="0"/>
-          <w:numId w:val="1053"/>
+          <w:numId w:val="1052"/>
         </w:numPr>
       </w:pPr>
       <w:r>
@@ -7027,7 +7021,7 @@
         <w:pStyle w:val="Compact"/>
         <w:numPr>
           <w:ilvl w:val="0"/>
-          <w:numId w:val="1053"/>
+          <w:numId w:val="1052"/>
         </w:numPr>
       </w:pPr>
       <w:r>
@@ -7039,7 +7033,7 @@
         <w:pStyle w:val="Compact"/>
         <w:numPr>
           <w:ilvl w:val="0"/>
-          <w:numId w:val="1053"/>
+          <w:numId w:val="1052"/>
         </w:numPr>
       </w:pPr>
       <w:r>
@@ -7051,7 +7045,7 @@
         <w:pStyle w:val="Compact"/>
         <w:numPr>
           <w:ilvl w:val="0"/>
-          <w:numId w:val="1053"/>
+          <w:numId w:val="1052"/>
         </w:numPr>
       </w:pPr>
       <w:r>
@@ -7063,7 +7057,7 @@
         <w:pStyle w:val="Compact"/>
         <w:numPr>
           <w:ilvl w:val="0"/>
-          <w:numId w:val="1053"/>
+          <w:numId w:val="1052"/>
         </w:numPr>
       </w:pPr>
       <w:r>
@@ -7075,7 +7069,7 @@
         <w:pStyle w:val="Compact"/>
         <w:numPr>
           <w:ilvl w:val="0"/>
-          <w:numId w:val="1053"/>
+          <w:numId w:val="1052"/>
         </w:numPr>
       </w:pPr>
       <w:r>
@@ -7087,7 +7081,7 @@
         <w:pStyle w:val="Compact"/>
         <w:numPr>
           <w:ilvl w:val="0"/>
-          <w:numId w:val="1053"/>
+          <w:numId w:val="1052"/>
         </w:numPr>
       </w:pPr>
       <w:r>
@@ -7099,7 +7093,7 @@
         <w:pStyle w:val="Compact"/>
         <w:numPr>
           <w:ilvl w:val="0"/>
-          <w:numId w:val="1053"/>
+          <w:numId w:val="1052"/>
         </w:numPr>
       </w:pPr>
       <w:r>
@@ -7111,7 +7105,7 @@
         <w:pStyle w:val="Compact"/>
         <w:numPr>
           <w:ilvl w:val="0"/>
-          <w:numId w:val="1053"/>
+          <w:numId w:val="1052"/>
         </w:numPr>
       </w:pPr>
       <w:r>
@@ -7123,7 +7117,7 @@
         <w:pStyle w:val="Compact"/>
         <w:numPr>
           <w:ilvl w:val="0"/>
-          <w:numId w:val="1053"/>
+          <w:numId w:val="1052"/>
         </w:numPr>
       </w:pPr>
       <w:r>
@@ -7135,7 +7129,7 @@
         <w:pStyle w:val="Compact"/>
         <w:numPr>
           <w:ilvl w:val="0"/>
-          <w:numId w:val="1053"/>
+          <w:numId w:val="1052"/>
         </w:numPr>
       </w:pPr>
       <w:r>
@@ -7147,7 +7141,7 @@
         <w:pStyle w:val="Compact"/>
         <w:numPr>
           <w:ilvl w:val="0"/>
-          <w:numId w:val="1053"/>
+          <w:numId w:val="1052"/>
         </w:numPr>
       </w:pPr>
       <w:r>
@@ -7159,7 +7153,7 @@
         <w:pStyle w:val="Compact"/>
         <w:numPr>
           <w:ilvl w:val="0"/>
-          <w:numId w:val="1053"/>
+          <w:numId w:val="1052"/>
         </w:numPr>
       </w:pPr>
       <w:r>
@@ -7171,7 +7165,7 @@
         <w:pStyle w:val="Compact"/>
         <w:numPr>
           <w:ilvl w:val="0"/>
-          <w:numId w:val="1053"/>
+          <w:numId w:val="1052"/>
         </w:numPr>
       </w:pPr>
       <w:r>
@@ -7183,7 +7177,7 @@
         <w:pStyle w:val="Compact"/>
         <w:numPr>
           <w:ilvl w:val="0"/>
-          <w:numId w:val="1053"/>
+          <w:numId w:val="1052"/>
         </w:numPr>
       </w:pPr>
       <w:r>
@@ -7195,7 +7189,7 @@
         <w:pStyle w:val="Compact"/>
         <w:numPr>
           <w:ilvl w:val="0"/>
-          <w:numId w:val="1053"/>
+          <w:numId w:val="1052"/>
         </w:numPr>
       </w:pPr>
       <w:r>
@@ -7207,7 +7201,7 @@
         <w:pStyle w:val="Compact"/>
         <w:numPr>
           <w:ilvl w:val="0"/>
-          <w:numId w:val="1053"/>
+          <w:numId w:val="1052"/>
         </w:numPr>
       </w:pPr>
       <w:r>
@@ -7219,7 +7213,7 @@
         <w:pStyle w:val="Compact"/>
         <w:numPr>
           <w:ilvl w:val="0"/>
-          <w:numId w:val="1053"/>
+          <w:numId w:val="1052"/>
         </w:numPr>
       </w:pPr>
       <w:r>
@@ -7231,7 +7225,7 @@
         <w:pStyle w:val="Compact"/>
         <w:numPr>
           <w:ilvl w:val="0"/>
-          <w:numId w:val="1053"/>
+          <w:numId w:val="1052"/>
         </w:numPr>
       </w:pPr>
       <w:r>
@@ -12577,34 +12571,7 @@
     <w:abstractNumId w:val="991"/>
   </w:num>
   <w:num w:numId="1044">
-    <w:abstractNumId w:val="99411"/>
-    <w:lvlOverride w:ilvl="0">
-      <w:startOverride w:val="1"/>
-    </w:lvlOverride>
-    <w:lvlOverride w:ilvl="1">
-      <w:startOverride w:val="1"/>
-    </w:lvlOverride>
-    <w:lvlOverride w:ilvl="2">
-      <w:startOverride w:val="1"/>
-    </w:lvlOverride>
-    <w:lvlOverride w:ilvl="3">
-      <w:startOverride w:val="1"/>
-    </w:lvlOverride>
-    <w:lvlOverride w:ilvl="4">
-      <w:startOverride w:val="1"/>
-    </w:lvlOverride>
-    <w:lvlOverride w:ilvl="5">
-      <w:startOverride w:val="1"/>
-    </w:lvlOverride>
-    <w:lvlOverride w:ilvl="6">
-      <w:startOverride w:val="1"/>
-    </w:lvlOverride>
-    <w:lvlOverride w:ilvl="7">
-      <w:startOverride w:val="1"/>
-    </w:lvlOverride>
-    <w:lvlOverride w:ilvl="8">
-      <w:startOverride w:val="1"/>
-    </w:lvlOverride>
+    <w:abstractNumId w:val="991"/>
   </w:num>
   <w:num w:numId="1045">
     <w:abstractNumId w:val="991"/>
@@ -12628,9 +12595,6 @@
     <w:abstractNumId w:val="991"/>
   </w:num>
   <w:num w:numId="1052">
-    <w:abstractNumId w:val="991"/>
-  </w:num>
-  <w:num w:numId="1053">
     <w:abstractNumId w:val="99411"/>
     <w:lvlOverride w:ilvl="0">
       <w:startOverride w:val="1"/>

</xml_diff>

<commit_message>
Address External Review: Fragility in Abstract, Creatinine-Defined AKI, Cuff Hypothesis; Licence and Citation
Abstract states that two AKI cases among the 28 upward-reclassified patients would have made
the equivalence verdict inconclusive, calls monitored time 'not waveform-flagged' rather than
'artefact-free', and names creatinine-defined KDIGO AKI (also in the title). The discussion
softens the cuff-cycle advice to a robustness check, since the cuff arm is not recorded. The
AI disclosure names the model version. Repository URL replaces the placeholder. MIT licence
for code, CITATION.cff, README licences. Both languages rebuilt.

Co-Authored-By: Claude Opus 5.5 <noreply@anthropic.com>
</commit_message>
<xml_diff>
--- a/paper/manuscript.docx
+++ b/paper/manuscript.docx
@@ -7,7 +7,7 @@
         <w:pStyle w:val="Title"/>
       </w:pPr>
       <w:r>
-        <w:t xml:space="preserve">How much recorded intraoperative hypotension is arterial-line artefact, and does it bias the association with acute kidney injury? A waveform-referenced cohort study</w:t>
+        <w:t xml:space="preserve">How much recorded intraoperative hypotension is arterial-line artefact, and does it bias the association with creatinine-defined acute kidney injury? A waveform-referenced cohort study</w:t>
       </w:r>
     </w:p>
     <w:p>
@@ -137,7 +137,13 @@
         <w:t xml:space="preserve"> </w:t>
       </w:r>
       <w:r>
-        <w:t xml:space="preserve">minutes with mean arterial pressure (MAP) below 65 mmHg were spurious.</w:t>
+        <w:t xml:space="preserve">minutes with mean arterial pressure (MAP) below 65 mmHg were spurious against the waveform</w:t>
+      </w:r>
+      <w:r>
+        <w:t xml:space="preserve"> </w:t>
+      </w:r>
+      <w:r>
+        <w:t xml:space="preserve">reference.</w:t>
       </w:r>
     </w:p>
     <w:p>
@@ -149,13 +155,13 @@
         </w:numPr>
       </w:pPr>
       <w:r>
-        <w:t xml:space="preserve">For ≥ 10 min of MAP below 65 mmHg, which was not associated with acute kidney injury (AKI)</w:t>
-      </w:r>
-      <w:r>
-        <w:t xml:space="preserve"> </w:t>
-      </w:r>
-      <w:r>
-        <w:t xml:space="preserve">after adjustment, artefact handling did not change the estimate (ratio of odds ratios 0.96,</w:t>
+        <w:t xml:space="preserve">For ≥ 10 min of MAP below 65 mmHg, which was not associated with acute kidney injury (AKI, by</w:t>
+      </w:r>
+      <w:r>
+        <w:t xml:space="preserve"> </w:t>
+      </w:r>
+      <w:r>
+        <w:t xml:space="preserve">creatinine) after adjustment, artefact handling did not change the estimate (ratio of odds ratios 0.96,</w:t>
       </w:r>
       <w:r>
         <w:t xml:space="preserve"> </w:t>
@@ -273,7 +279,7 @@
         <w:t xml:space="preserve"> </w:t>
       </w:r>
       <w:r>
-        <w:t xml:space="preserve">is artefact and whether artefact handling biases the association.</w:t>
+        <w:t xml:space="preserve">is artefact and whether it biases the association.</w:t>
       </w:r>
     </w:p>
     <w:p>
@@ -291,37 +297,37 @@
         <w:t xml:space="preserve"> </w:t>
       </w:r>
       <w:r>
-        <w:t xml:space="preserve">In 3,249 adults from the open VitalDB dataset, each 2-s monitor value was labelled</w:t>
-      </w:r>
-      <w:r>
-        <w:t xml:space="preserve"> </w:t>
-      </w:r>
-      <w:r>
-        <w:t xml:space="preserve">from the 500 Hz arterial waveform, giving a waveform-referenced series. We compared it with 420</w:t>
-      </w:r>
-      <w:r>
-        <w:t xml:space="preserve"> </w:t>
-      </w:r>
-      <w:r>
-        <w:t xml:space="preserve">retrospective pipelines (7 filters × 5 resolutions × 4 metrics × 3 thresholds). The primary</w:t>
-      </w:r>
-      <w:r>
-        <w:t xml:space="preserve"> </w:t>
-      </w:r>
-      <w:r>
-        <w:t xml:space="preserve">estimand was the ratio of adjusted odds ratios (ROR) for KDIGO AKI with ≥ 10 min of mean</w:t>
-      </w:r>
-      <w:r>
-        <w:t xml:space="preserve"> </w:t>
-      </w:r>
-      <w:r>
-        <w:t xml:space="preserve">arterial pressure below 65 mmHg, comparing per-minute medians with a range filter against the</w:t>
-      </w:r>
-      <w:r>
-        <w:t xml:space="preserve"> </w:t>
-      </w:r>
-      <w:r>
-        <w:t xml:space="preserve">reference. The pre-specified equivalence margin was 0.80–1.25.</w:t>
+        <w:t xml:space="preserve">In 3,249 adults from VitalDB, each 2-s monitor value was labelled</w:t>
+      </w:r>
+      <w:r>
+        <w:t xml:space="preserve"> </w:t>
+      </w:r>
+      <w:r>
+        <w:t xml:space="preserve">from the 500 Hz arterial waveform, giving a waveform reference, and compared with 420</w:t>
+      </w:r>
+      <w:r>
+        <w:t xml:space="preserve"> </w:t>
+      </w:r>
+      <w:r>
+        <w:t xml:space="preserve">retrospective processing pipelines. The primary estimand was the ratio of adjusted odds ratios</w:t>
+      </w:r>
+      <w:r>
+        <w:t xml:space="preserve"> </w:t>
+      </w:r>
+      <w:r>
+        <w:t xml:space="preserve">(ROR) for AKI by KDIGO creatinine criteria with ≥ 10 min of mean arterial pressure below</w:t>
+      </w:r>
+      <w:r>
+        <w:t xml:space="preserve"> </w:t>
+      </w:r>
+      <w:r>
+        <w:t xml:space="preserve">65 mmHg, comparing per-minute medians with a range filter against the reference. The</w:t>
+      </w:r>
+      <w:r>
+        <w:t xml:space="preserve"> </w:t>
+      </w:r>
+      <w:r>
+        <w:t xml:space="preserve">pre-specified equivalence margin was 0.80–1.25.</w:t>
       </w:r>
     </w:p>
     <w:p>
@@ -339,43 +345,43 @@
         <w:t xml:space="preserve"> </w:t>
       </w:r>
       <w:r>
-        <w:t xml:space="preserve">Of monitored time, 96.3% was artefact-free. With per-minute medians, 0.7% of</w:t>
-      </w:r>
-      <w:r>
-        <w:t xml:space="preserve"> </w:t>
-      </w:r>
-      <w:r>
-        <w:t xml:space="preserve">recorded hypotensive minutes were spurious; with one instantaneous value per minute, 3.3%. AKI</w:t>
-      </w:r>
-      <w:r>
-        <w:t xml:space="preserve"> </w:t>
-      </w:r>
-      <w:r>
-        <w:t xml:space="preserve">occurred in 91 of 2,563 patients (3.6%). The adjusted odds ratio was 0.94 (95% CI 0.60–1.48)</w:t>
-      </w:r>
-      <w:r>
-        <w:t xml:space="preserve"> </w:t>
-      </w:r>
-      <w:r>
-        <w:t xml:space="preserve">with the reference and 0.90 (0.57–1.42) with the pipeline, giving an ROR of 0.96 (0.86–1.06),</w:t>
-      </w:r>
-      <w:r>
-        <w:t xml:space="preserve"> </w:t>
-      </w:r>
-      <w:r>
-        <w:t xml:space="preserve">which was equivalent. Exposure differed in 33 patients, none with AKI. Spurious hypotension</w:t>
-      </w:r>
-      <w:r>
-        <w:t xml:space="preserve"> </w:t>
-      </w:r>
-      <w:r>
-        <w:t xml:space="preserve">showed no detectable association with AKI. Arterial artefact rose from 4% to 26% during cuff</w:t>
-      </w:r>
-      <w:r>
-        <w:t xml:space="preserve"> </w:t>
-      </w:r>
-      <w:r>
-        <w:t xml:space="preserve">measurement.</w:t>
+        <w:t xml:space="preserve">Of monitored time, 96.3% was not waveform-flagged. With per-minute medians, 0.7% of</w:t>
+      </w:r>
+      <w:r>
+        <w:t xml:space="preserve"> </w:t>
+      </w:r>
+      <w:r>
+        <w:t xml:space="preserve">recorded hypotensive minutes were spurious against the reference; with one value per minute,</w:t>
+      </w:r>
+      <w:r>
+        <w:t xml:space="preserve"> </w:t>
+      </w:r>
+      <w:r>
+        <w:t xml:space="preserve">3.3%. AKI occurred in 91 of 2,563 patients (3.6%). Adjusted odds ratios were 0.94 (95% CI</w:t>
+      </w:r>
+      <w:r>
+        <w:t xml:space="preserve"> </w:t>
+      </w:r>
+      <w:r>
+        <w:t xml:space="preserve">0.60–1.48) with the reference and 0.90 (0.57–1.42) with the pipeline: ROR 0.96 (0.86–1.06),</w:t>
+      </w:r>
+      <w:r>
+        <w:t xml:space="preserve"> </w:t>
+      </w:r>
+      <w:r>
+        <w:t xml:space="preserve">within the margin. Exposure differed in 33 patients, none with AKI; two AKI cases among the 28</w:t>
+      </w:r>
+      <w:r>
+        <w:t xml:space="preserve"> </w:t>
+      </w:r>
+      <w:r>
+        <w:t xml:space="preserve">reclassified upwards would have made the verdict inconclusive. Spurious hypotension showed no</w:t>
+      </w:r>
+      <w:r>
+        <w:t xml:space="preserve"> </w:t>
+      </w:r>
+      <w:r>
+        <w:t xml:space="preserve">detectable association with AKI. Arterial artefact rose from 4% to 26% during cuff measurement.</w:t>
       </w:r>
     </w:p>
     <w:p>
@@ -399,19 +405,19 @@
         <w:t xml:space="preserve"> </w:t>
       </w:r>
       <w:r>
-        <w:t xml:space="preserve">detectably change the association between hypotension and AKI. This held for the pre-specified</w:t>
-      </w:r>
-      <w:r>
-        <w:t xml:space="preserve"> </w:t>
-      </w:r>
-      <w:r>
-        <w:t xml:space="preserve">exposure, which was not associated with AKI after adjustment, and post hoc for exposures that</w:t>
-      </w:r>
-      <w:r>
-        <w:t xml:space="preserve"> </w:t>
-      </w:r>
-      <w:r>
-        <w:t xml:space="preserve">were. Running-median smoothing and unfiltered area-based exposures should be avoided.</w:t>
+        <w:t xml:space="preserve">detectably change the association between hypotension and AKI, but this verdict rests on few</w:t>
+      </w:r>
+      <w:r>
+        <w:t xml:space="preserve"> </w:t>
+      </w:r>
+      <w:r>
+        <w:t xml:space="preserve">discordant patients. Post hoc, the same held for exposures associated with AKI. Running-median</w:t>
+      </w:r>
+      <w:r>
+        <w:t xml:space="preserve"> </w:t>
+      </w:r>
+      <w:r>
+        <w:t xml:space="preserve">smoothing and unfiltered area-based exposures should be avoided.</w:t>
       </w:r>
     </w:p>
     <w:p>
@@ -858,7 +864,7 @@
         <w:pStyle w:val="BodyText"/>
       </w:pPr>
       <w:r>
-        <w:t xml:space="preserve">A large language model (Claude, Anthropic) was used under the author’s direction to write the</w:t>
+        <w:t xml:space="preserve">A large language model (Claude Opus 5.5, Anthropic) was used under the author’s direction to write the</w:t>
       </w:r>
       <w:r>
         <w:t xml:space="preserve"> </w:t>
@@ -5506,13 +5512,19 @@
         <w:t xml:space="preserve"> </w:t>
       </w:r>
       <w:r>
-        <w:t xml:space="preserve">explanation. Studies of discordance should exclude arterial values from the cuff cycle, or</w:t>
-      </w:r>
-      <w:r>
-        <w:t xml:space="preserve"> </w:t>
-      </w:r>
-      <w:r>
-        <w:t xml:space="preserve">show that their results survive the exclusion.</w:t>
+        <w:t xml:space="preserve">explanation, and because VitalDB does not record the cuff arm, occlusion remains a hypothesis.</w:t>
+      </w:r>
+      <w:r>
+        <w:t xml:space="preserve"> </w:t>
+      </w:r>
+      <w:r>
+        <w:t xml:space="preserve">Studies of discordance should check whether their results survive excluding arterial values</w:t>
+      </w:r>
+      <w:r>
+        <w:t xml:space="preserve"> </w:t>
+      </w:r>
+      <w:r>
+        <w:t xml:space="preserve">from the cuff cycle.</w:t>
       </w:r>
     </w:p>
     <w:p>
@@ -6355,7 +6367,13 @@
         <w:t xml:space="preserve"> </w:t>
       </w:r>
       <w:r>
-        <w:t xml:space="preserve">results and the 400-snippet adjudication set are available at [REPOSITORY URL]. The</w:t>
+        <w:t xml:space="preserve">results and the 400-snippet adjudication set are available at</w:t>
+      </w:r>
+      <w:r>
+        <w:t xml:space="preserve"> </w:t>
+      </w:r>
+      <w:r>
+        <w:t xml:space="preserve">https://github.com/olegtropinin/ioh-artifact-study. The</w:t>
       </w:r>
       <w:r>
         <w:t xml:space="preserve"> </w:t>
@@ -6385,7 +6403,7 @@
         <w:t xml:space="preserve"> </w:t>
       </w:r>
       <w:r>
-        <w:t xml:space="preserve">The author used an AI system (Claude, Anthropic) for</w:t>
+        <w:t xml:space="preserve">The author used an AI system (Claude Opus 5.5, Anthropic) for</w:t>
       </w:r>
       <w:r>
         <w:t xml:space="preserve"> </w:t>

</xml_diff>

<commit_message>
Add Zenodo DOI 10.5281/zenodo.23726000 to Manuscript, README and Citation
Co-Authored-By: Claude Opus 5.5 <noreply@anthropic.com>
</commit_message>
<xml_diff>
--- a/paper/manuscript.docx
+++ b/paper/manuscript.docx
@@ -6373,7 +6373,13 @@
         <w:t xml:space="preserve"> </w:t>
       </w:r>
       <w:r>
-        <w:t xml:space="preserve">https://github.com/olegtropinin/ioh-artifact-study. The</w:t>
+        <w:t xml:space="preserve">https://github.com/olegtropinin/ioh-artifact-study (archived at Zenodo,</w:t>
+      </w:r>
+      <w:r>
+        <w:t xml:space="preserve"> </w:t>
+      </w:r>
+      <w:r>
+        <w:t xml:space="preserve">https://doi.org/10.5281/zenodo.23726000). The</w:t>
       </w:r>
       <w:r>
         <w:t xml:space="preserve"> </w:t>

</xml_diff>

<commit_message>
State VitalDB IRB Approval Number and Consent Waiver; Add ORCID to Title Page
Co-Authored-By: Claude Opus 5.5 <noreply@anthropic.com>
</commit_message>
<xml_diff>
--- a/paper/manuscript.docx
+++ b/paper/manuscript.docx
@@ -43,7 +43,7 @@
         <w:t xml:space="preserve"> </w:t>
       </w:r>
       <w:r>
-        <w:t xml:space="preserve">Oleg Tropynin</w:t>
+        <w:t xml:space="preserve">Oleg Tropynin (ORCID 0009-0006-5431-4285)</w:t>
       </w:r>
     </w:p>
     <w:p>
@@ -6289,19 +6289,25 @@
         <w:t xml:space="preserve"> </w:t>
       </w:r>
       <w:r>
-        <w:t xml:space="preserve">dataset. Collection of the data was approved by the institutional review board of Seoul</w:t>
-      </w:r>
-      <w:r>
-        <w:t xml:space="preserve"> </w:t>
-      </w:r>
-      <w:r>
-        <w:t xml:space="preserve">National University Hospital, as described in the data descriptor [18]. No further</w:t>
-      </w:r>
-      <w:r>
-        <w:t xml:space="preserve"> </w:t>
-      </w:r>
-      <w:r>
-        <w:t xml:space="preserve">approval or consent was required.</w:t>
+        <w:t xml:space="preserve">dataset. The acquisition and public release of the data were approved by the Institutional</w:t>
+      </w:r>
+      <w:r>
+        <w:t xml:space="preserve"> </w:t>
+      </w:r>
+      <w:r>
+        <w:t xml:space="preserve">Review Board of Seoul National University Hospital (H-1408-101-605), which waived written</w:t>
+      </w:r>
+      <w:r>
+        <w:t xml:space="preserve"> </w:t>
+      </w:r>
+      <w:r>
+        <w:t xml:space="preserve">informed consent because the data are anonymous [18]. No further ethics approval or</w:t>
+      </w:r>
+      <w:r>
+        <w:t xml:space="preserve"> </w:t>
+      </w:r>
+      <w:r>
+        <w:t xml:space="preserve">consent was required for this analysis.</w:t>
       </w:r>
     </w:p>
     <w:p>

</xml_diff>